<commit_message>
Record the production deletion test
USR-08: two accounts deleted through the Team page, three minutes after the
feature shipped. Accounts fell from 11 to 9 and six tickets were released --
CP-000008, 016, 023, 025, 030 and 033 -- each with its own audit row naming who
was removed. No issue was deleted, which was the whole point.

It is the only case in the document confirmed on production data rather than in
a rolled-back transaction, because deletion is the one feature whose effects
cannot be rehearsed and undone.

The invitation flow is still listed as untested, and the database agrees: the
newest account was created on 9 August and the invite path deployed on the
11th, so nothing has gone through it yet.

Co-Authored-By: Claude Opus 5 <noreply@anthropic.com>
</commit_message>
<xml_diff>
--- a/CivicPulse_Test_Cases.docx
+++ b/CivicPulse_Test_Cases.docx
@@ -4672,13 +4672,57 @@
           </w:p>
         </w:tc>
       </w:tr>
+      <w:tr>
+        <w:tc>
+          <w:tcPr>
+            <w:tcW w:w="900" w:type="dxa"/>
+            <w:vAlign w:val="center"/>
+          </w:tcPr>
+          <w:p>
+            <w:pPr>
+              <w:pStyle w:val="TableTextX"/>
+            </w:pPr>
+            <w:r>
+              <w:t xml:space="preserve">USR-08</w:t>
+            </w:r>
+          </w:p>
+        </w:tc>
+        <w:tc>
+          <w:tcPr>
+            <w:tcW w:w="4600" w:type="dxa"/>
+            <w:vAlign w:val="center"/>
+          </w:tcPr>
+          <w:p>
+            <w:pPr>
+              <w:pStyle w:val="TableTextX"/>
+            </w:pPr>
+            <w:r>
+              <w:t xml:space="preserve">Two real deletions through the Team page, three minutes after release</w:t>
+            </w:r>
+          </w:p>
+        </w:tc>
+        <w:tc>
+          <w:tcPr>
+            <w:tcW w:w="3500" w:type="dxa"/>
+            <w:vAlign w:val="center"/>
+          </w:tcPr>
+          <w:p>
+            <w:pPr>
+              <w:pStyle w:val="TableTextX"/>
+            </w:pPr>
+            <w:r>
+              <w:t xml:space="preserve">Accounts fell from 11 to 9. Six tickets released across the two — CP-000008, 016, 023, 025, 030 and 033 — each with its own audit row naming who was removed. No issue was deleted</w:t>
+            </w:r>
+          </w:p>
+        </w:tc>
+      </w:tr>
     </w:tbl>
     <w:p>
       <w:pPr>
         <w:pStyle w:val="NoteX"/>
       </w:pPr>
       <w:r>
-        <w:t xml:space="preserve">Not yet exercised through the interface: self-delete refusal, the super-admin refusal, and a staff admin attempting to delete an engineer outside their department. All three are enforced in the Edge Function and mirrored in the UI, but only the database half has been tested.</w:t>
+        <w:t xml:space="preserve">USR-08 is the only case in this document confirmed on production data rather than in a rolled-back transaction, because deletion is the one feature whose effects cannot be rehearsed and then undone. Three refusals remain untested: deleting yourself, deleting a super admin, and a staff admin reaching an engineer in another department. All are enforced in the Edge Function and mirrored in the interface.</w:t>
       </w:r>
     </w:p>
     <w:p>
@@ -5985,7 +6029,7 @@
         <w:pStyle w:val="BodyX"/>
       </w:pPr>
       <w:r>
-        <w:t xml:space="preserve">•  User deletion has been verified in the database but not through the interface — the self-delete, super-admin and cross-department refusals are untested.</w:t>
+        <w:t xml:space="preserve">•  User deletion works and has been used in production (USR-08), but three refusals remain untested: self-delete, deleting a super admin, and reaching another department’s engineer.</w:t>
       </w:r>
     </w:p>
     <w:p>

</xml_diff>